<commit_message>
ampliar modelo dimensional con pagos y documentacion
</commit_message>
<xml_diff>
--- a/documentacion/Proyecto1_Invacom.docx
+++ b/documentacion/Proyecto1_Invacom.docx
@@ -39,7 +39,7 @@
                     </pic:cNvPicPr>
                   </pic:nvPicPr>
                   <pic:blipFill>
-                    <a:blip r:embed="rId7">
+                    <a:blip r:embed="rId8">
                       <a:extLst>
                         <a:ext uri="{28A0092B-C50C-407E-A947-70E740481C1C}">
                           <a14:useLocalDpi xmlns:a14="http://schemas.microsoft.com/office/drawing/2010/main" val="0"/>
@@ -211,36 +211,8 @@
           <w:sz w:val="32"/>
           <w:szCs w:val="32"/>
         </w:rPr>
-        <w:t xml:space="preserve">Data </w:t>
-      </w:r>
-      <w:proofErr w:type="spellStart"/>
-      <w:r>
-        <w:rPr>
-          <w:rFonts w:ascii="Times New Roman" w:hAnsi="Times New Roman" w:cs="Times New Roman"/>
-          <w:sz w:val="32"/>
-          <w:szCs w:val="32"/>
-        </w:rPr>
-        <w:t>WareHouse</w:t>
-      </w:r>
-      <w:proofErr w:type="spellEnd"/>
-      <w:r>
-        <w:rPr>
-          <w:rFonts w:ascii="Times New Roman" w:hAnsi="Times New Roman" w:cs="Times New Roman"/>
-          <w:sz w:val="32"/>
-          <w:szCs w:val="32"/>
-        </w:rPr>
-        <w:t xml:space="preserve"> </w:t>
-      </w:r>
-      <w:proofErr w:type="spellStart"/>
-      <w:r>
-        <w:rPr>
-          <w:rFonts w:ascii="Times New Roman" w:hAnsi="Times New Roman" w:cs="Times New Roman"/>
-          <w:sz w:val="32"/>
-          <w:szCs w:val="32"/>
-        </w:rPr>
-        <w:t>Invacom</w:t>
-      </w:r>
-      <w:proofErr w:type="spellEnd"/>
+        <w:t>Data WareHouse Invacom</w:t>
+      </w:r>
     </w:p>
     <w:p>
       <w:pPr>
@@ -397,7 +369,7 @@
           <w:szCs w:val="32"/>
         </w:rPr>
       </w:pPr>
-      <w:hyperlink r:id="rId8" w:history="1">
+      <w:hyperlink r:id="rId9" w:history="1">
         <w:r>
           <w:rPr>
             <w:rFonts w:ascii="Times New Roman" w:hAnsi="Times New Roman" w:cs="Times New Roman"/>
@@ -543,66 +515,30 @@
           <w:rFonts w:ascii="Times New Roman" w:hAnsi="Times New Roman" w:cs="Times New Roman"/>
         </w:rPr>
       </w:pPr>
-      <w:proofErr w:type="spellStart"/>
-      <w:r>
-        <w:rPr>
-          <w:rFonts w:ascii="Times New Roman" w:hAnsi="Times New Roman" w:cs="Times New Roman"/>
-        </w:rPr>
-        <w:t>Invacom</w:t>
-      </w:r>
-      <w:proofErr w:type="spellEnd"/>
+      <w:r>
+        <w:rPr>
+          <w:rFonts w:ascii="Times New Roman" w:hAnsi="Times New Roman" w:cs="Times New Roman"/>
+        </w:rPr>
+        <w:t xml:space="preserve">Invacom Inc S.A. necesita implementar un data warehouse </w:t>
+      </w:r>
+      <w:r>
+        <w:rPr>
+          <w:rFonts w:ascii="Times New Roman" w:hAnsi="Times New Roman" w:cs="Times New Roman"/>
+        </w:rPr>
+        <w:t xml:space="preserve">(DW) </w:t>
+      </w:r>
+      <w:r>
+        <w:rPr>
+          <w:rFonts w:ascii="Times New Roman" w:hAnsi="Times New Roman" w:cs="Times New Roman"/>
+        </w:rPr>
+        <w:t>que le permita analizar la información de sus ventas</w:t>
+      </w:r>
       <w:r>
         <w:rPr>
           <w:rFonts w:ascii="Times New Roman" w:hAnsi="Times New Roman" w:cs="Times New Roman"/>
         </w:rPr>
         <w:t xml:space="preserve"> </w:t>
       </w:r>
-      <w:proofErr w:type="spellStart"/>
-      <w:r>
-        <w:rPr>
-          <w:rFonts w:ascii="Times New Roman" w:hAnsi="Times New Roman" w:cs="Times New Roman"/>
-        </w:rPr>
-        <w:t>Inc</w:t>
-      </w:r>
-      <w:proofErr w:type="spellEnd"/>
-      <w:r>
-        <w:rPr>
-          <w:rFonts w:ascii="Times New Roman" w:hAnsi="Times New Roman" w:cs="Times New Roman"/>
-        </w:rPr>
-        <w:t xml:space="preserve"> S.A. necesita implementar un data </w:t>
-      </w:r>
-      <w:proofErr w:type="spellStart"/>
-      <w:r>
-        <w:rPr>
-          <w:rFonts w:ascii="Times New Roman" w:hAnsi="Times New Roman" w:cs="Times New Roman"/>
-        </w:rPr>
-        <w:t>warehouse</w:t>
-      </w:r>
-      <w:proofErr w:type="spellEnd"/>
-      <w:r>
-        <w:rPr>
-          <w:rFonts w:ascii="Times New Roman" w:hAnsi="Times New Roman" w:cs="Times New Roman"/>
-        </w:rPr>
-        <w:t xml:space="preserve"> </w:t>
-      </w:r>
-      <w:r>
-        <w:rPr>
-          <w:rFonts w:ascii="Times New Roman" w:hAnsi="Times New Roman" w:cs="Times New Roman"/>
-        </w:rPr>
-        <w:t xml:space="preserve">(DW) </w:t>
-      </w:r>
-      <w:r>
-        <w:rPr>
-          <w:rFonts w:ascii="Times New Roman" w:hAnsi="Times New Roman" w:cs="Times New Roman"/>
-        </w:rPr>
-        <w:t>que le permita analizar la información de sus ventas</w:t>
-      </w:r>
-      <w:r>
-        <w:rPr>
-          <w:rFonts w:ascii="Times New Roman" w:hAnsi="Times New Roman" w:cs="Times New Roman"/>
-        </w:rPr>
-        <w:t xml:space="preserve"> </w:t>
-      </w:r>
       <w:r>
         <w:rPr>
           <w:rFonts w:ascii="Times New Roman" w:hAnsi="Times New Roman" w:cs="Times New Roman"/>
@@ -647,21 +583,7 @@
         <w:rPr>
           <w:rFonts w:ascii="Times New Roman" w:hAnsi="Times New Roman" w:cs="Times New Roman"/>
         </w:rPr>
-        <w:t xml:space="preserve">El problema que atiende este proyecto es que no existe una base de datos integrada y depurada desde la cual </w:t>
-      </w:r>
-      <w:proofErr w:type="spellStart"/>
-      <w:r>
-        <w:rPr>
-          <w:rFonts w:ascii="Times New Roman" w:hAnsi="Times New Roman" w:cs="Times New Roman"/>
-        </w:rPr>
-        <w:t>Invacom</w:t>
-      </w:r>
-      <w:proofErr w:type="spellEnd"/>
-      <w:r>
-        <w:rPr>
-          <w:rFonts w:ascii="Times New Roman" w:hAnsi="Times New Roman" w:cs="Times New Roman"/>
-        </w:rPr>
-        <w:t xml:space="preserve"> pueda consultar sus ventas por fecha, cliente, producto y vendedor. La información está separada como la guarda el sistema transaccional. Para obtener las ventas de un vendedor por país y por trimestre hay que combinar al menos cuatro archivos: pedidos, detalle de pedidos, clientes y empleados. La fecha de cada pedido aparece como un solo valor, sin el mes, el trimestre y el año separados para agrupar. El enunciado pide presentar los resultados en tablas dinámicas de Excel conectadas al DW, y eso requiere que los datos estén ya unidos y organizados.</w:t>
+        <w:t>El problema que atiende este proyecto es que no existe una base de datos integrada y depurada desde la cual Invacom pueda consultar sus ventas por fecha, cliente, producto y vendedor. La información está separada como la guarda el sistema transaccional. Para obtener las ventas de un vendedor por país y por trimestre hay que combinar al menos cuatro archivos: pedidos, detalle de pedidos, clientes y empleados. La fecha de cada pedido aparece como un solo valor, sin el mes, el trimestre y el año separados para agrupar. El enunciado pide presentar los resultados en tablas dinámicas de Excel conectadas al DW, y eso requiere que los datos estén ya unidos y organizados.</w:t>
       </w:r>
     </w:p>
     <w:p>
@@ -677,6 +599,249 @@
         </w:rPr>
         <w:t>En la revisión inicial de los archivos, el grupo encontró varios problemas de calidad. Ocho registros de products.csv tienen comillas dobles sin escapar dentro de la descripción, y en cuatro de ellos las columnas se desplazan al leer el archivo. Los campos vacíos aparecen con el texto NULL. Hay 14 pedidos sin fecha de envío y 22 clientes sin vendedor asignado, aunque ninguno de estos 22 clientes tiene pedidos. Uno de los puestos está escrito como “Sale Manager (EMEA)”, mientras que los demás gerentes regionales aparecen como “Sales Manager”.</w:t>
       </w:r>
+    </w:p>
+    <w:p>
+      <w:pPr>
+        <w:ind w:firstLine="720"/>
+        <w:rPr>
+          <w:rFonts w:ascii="Times New Roman" w:hAnsi="Times New Roman" w:cs="Times New Roman"/>
+        </w:rPr>
+      </w:pPr>
+    </w:p>
+    <w:p>
+      <w:pPr>
+        <w:ind w:firstLine="720"/>
+        <w:rPr>
+          <w:rFonts w:ascii="Times New Roman" w:hAnsi="Times New Roman" w:cs="Times New Roman"/>
+        </w:rPr>
+      </w:pPr>
+    </w:p>
+    <w:p>
+      <w:pPr>
+        <w:ind w:firstLine="720"/>
+        <w:rPr>
+          <w:rFonts w:ascii="Times New Roman" w:hAnsi="Times New Roman" w:cs="Times New Roman"/>
+        </w:rPr>
+      </w:pPr>
+    </w:p>
+    <w:p>
+      <w:pPr>
+        <w:ind w:firstLine="720"/>
+        <w:rPr>
+          <w:rFonts w:ascii="Times New Roman" w:hAnsi="Times New Roman" w:cs="Times New Roman"/>
+        </w:rPr>
+      </w:pPr>
+    </w:p>
+    <w:p>
+      <w:pPr>
+        <w:ind w:firstLine="720"/>
+        <w:rPr>
+          <w:rFonts w:ascii="Times New Roman" w:hAnsi="Times New Roman" w:cs="Times New Roman"/>
+        </w:rPr>
+      </w:pPr>
+    </w:p>
+    <w:p>
+      <w:pPr>
+        <w:ind w:firstLine="720"/>
+        <w:rPr>
+          <w:rFonts w:ascii="Times New Roman" w:hAnsi="Times New Roman" w:cs="Times New Roman"/>
+        </w:rPr>
+      </w:pPr>
+    </w:p>
+    <w:p>
+      <w:pPr>
+        <w:ind w:firstLine="720"/>
+        <w:rPr>
+          <w:rFonts w:ascii="Times New Roman" w:hAnsi="Times New Roman" w:cs="Times New Roman"/>
+        </w:rPr>
+      </w:pPr>
+    </w:p>
+    <w:p>
+      <w:pPr>
+        <w:ind w:firstLine="720"/>
+        <w:rPr>
+          <w:rFonts w:ascii="Times New Roman" w:hAnsi="Times New Roman" w:cs="Times New Roman"/>
+        </w:rPr>
+      </w:pPr>
+    </w:p>
+    <w:p>
+      <w:pPr>
+        <w:ind w:firstLine="720"/>
+        <w:rPr>
+          <w:rFonts w:ascii="Times New Roman" w:hAnsi="Times New Roman" w:cs="Times New Roman"/>
+        </w:rPr>
+      </w:pPr>
+    </w:p>
+    <w:p>
+      <w:pPr>
+        <w:ind w:firstLine="720"/>
+        <w:jc w:val="center"/>
+        <w:rPr>
+          <w:rFonts w:ascii="Times New Roman" w:hAnsi="Times New Roman" w:cs="Times New Roman"/>
+          <w:b/>
+          <w:bCs/>
+          <w:sz w:val="28"/>
+          <w:szCs w:val="28"/>
+          <w:lang w:val="es-CR"/>
+        </w:rPr>
+      </w:pPr>
+      <w:r>
+        <w:rPr>
+          <w:rFonts w:ascii="Times New Roman" w:hAnsi="Times New Roman" w:cs="Times New Roman"/>
+          <w:b/>
+          <w:bCs/>
+          <w:sz w:val="28"/>
+          <w:szCs w:val="28"/>
+          <w:lang w:val="es-CR"/>
+        </w:rPr>
+        <w:lastRenderedPageBreak/>
+        <w:t>Objetivo general</w:t>
+      </w:r>
+    </w:p>
+    <w:p>
+      <w:pPr>
+        <w:ind w:firstLine="720"/>
+        <w:rPr>
+          <w:rFonts w:ascii="Times New Roman" w:hAnsi="Times New Roman" w:cs="Times New Roman"/>
+          <w:lang w:val="es-CR"/>
+        </w:rPr>
+      </w:pPr>
+      <w:r>
+        <w:rPr>
+          <w:rFonts w:ascii="Times New Roman" w:hAnsi="Times New Roman" w:cs="Times New Roman"/>
+          <w:lang w:val="es-CR"/>
+        </w:rPr>
+        <w:t>Diseñar e implementar un Data Warehouse para la empresa Invacom Inc. S.A., mediante el uso de Oracle Database y Pentaho Data Integration (Kettle), integrando información de clientes, productos, pedidos, vendedores y pagos a través de procesos de extracción, transformación y carga (ETL), con el propósito de facilitar el análisis de información comercial y financiera mediante reportes y tablas dinámicas en Microsoft Excel.</w:t>
+      </w:r>
+    </w:p>
+    <w:p>
+      <w:pPr>
+        <w:ind w:firstLine="720"/>
+        <w:jc w:val="center"/>
+        <w:rPr>
+          <w:rFonts w:ascii="Times New Roman" w:hAnsi="Times New Roman" w:cs="Times New Roman"/>
+          <w:b/>
+          <w:bCs/>
+          <w:sz w:val="28"/>
+          <w:szCs w:val="28"/>
+          <w:lang w:val="es-CR"/>
+        </w:rPr>
+      </w:pPr>
+      <w:r>
+        <w:rPr>
+          <w:rFonts w:ascii="Times New Roman" w:hAnsi="Times New Roman" w:cs="Times New Roman"/>
+          <w:b/>
+          <w:bCs/>
+          <w:sz w:val="28"/>
+          <w:szCs w:val="28"/>
+          <w:lang w:val="es-CR"/>
+        </w:rPr>
+        <w:t>Objetivos específicos</w:t>
+      </w:r>
+    </w:p>
+    <w:p>
+      <w:pPr>
+        <w:numPr>
+          <w:ilvl w:val="0"/>
+          <w:numId w:val="2"/>
+        </w:numPr>
+        <w:rPr>
+          <w:rFonts w:ascii="Times New Roman" w:hAnsi="Times New Roman" w:cs="Times New Roman"/>
+          <w:lang w:val="es-CR"/>
+        </w:rPr>
+      </w:pPr>
+      <w:r>
+        <w:rPr>
+          <w:rFonts w:ascii="Times New Roman" w:hAnsi="Times New Roman" w:cs="Times New Roman"/>
+          <w:lang w:val="es-CR"/>
+        </w:rPr>
+        <w:t>Analizar la estructura, las relaciones y la calidad de los datos provenientes de los ocho archivos CSV de la base de datos Classic Models, identificando valores nulos, inconsistencias, registros duplicados y problemas de formato que puedan afectar su procesamiento.</w:t>
+      </w:r>
+    </w:p>
+    <w:p>
+      <w:pPr>
+        <w:numPr>
+          <w:ilvl w:val="0"/>
+          <w:numId w:val="2"/>
+        </w:numPr>
+        <w:rPr>
+          <w:rFonts w:ascii="Times New Roman" w:hAnsi="Times New Roman" w:cs="Times New Roman"/>
+          <w:lang w:val="es-CR"/>
+        </w:rPr>
+      </w:pPr>
+      <w:r>
+        <w:rPr>
+          <w:rFonts w:ascii="Times New Roman" w:hAnsi="Times New Roman" w:cs="Times New Roman"/>
+          <w:lang w:val="es-CR"/>
+        </w:rPr>
+        <w:t>Diseñar un modelo dimensional que incorpore las dimensiones de clientes, productos, fechas y vendedores, así como las tablas de hechos de ventas y pagos, estableciendo sus claves, relaciones, medidas y niveles de granularidad.</w:t>
+      </w:r>
+    </w:p>
+    <w:p>
+      <w:pPr>
+        <w:numPr>
+          <w:ilvl w:val="0"/>
+          <w:numId w:val="2"/>
+        </w:numPr>
+        <w:rPr>
+          <w:rFonts w:ascii="Times New Roman" w:hAnsi="Times New Roman" w:cs="Times New Roman"/>
+          <w:lang w:val="es-CR"/>
+        </w:rPr>
+      </w:pPr>
+      <w:r>
+        <w:rPr>
+          <w:rFonts w:ascii="Times New Roman" w:hAnsi="Times New Roman" w:cs="Times New Roman"/>
+          <w:lang w:val="es-CR"/>
+        </w:rPr>
+        <w:t>Desarrollar procesos ETL utilizando Pentaho Data Integration (Kettle) para extraer, limpiar, transformar e integrar los datos de las fuentes originales, garantizando la consistencia de la información antes de su almacenamiento.</w:t>
+      </w:r>
+    </w:p>
+    <w:p>
+      <w:pPr>
+        <w:numPr>
+          <w:ilvl w:val="0"/>
+          <w:numId w:val="2"/>
+        </w:numPr>
+        <w:rPr>
+          <w:rFonts w:ascii="Times New Roman" w:hAnsi="Times New Roman" w:cs="Times New Roman"/>
+          <w:lang w:val="es-CR"/>
+        </w:rPr>
+      </w:pPr>
+      <w:r>
+        <w:rPr>
+          <w:rFonts w:ascii="Times New Roman" w:hAnsi="Times New Roman" w:cs="Times New Roman"/>
+          <w:lang w:val="es-CR"/>
+        </w:rPr>
+        <w:t>Implementar el Data Warehouse en Oracle Database mediante la creación de tablas dimensionales y de hechos, verificando la integridad y trazabilidad de los 2.996 registros de detalle de pedidos y los 273 registros de pagos, conforme a las reglas de negocio establecidas.</w:t>
+      </w:r>
+    </w:p>
+    <w:p>
+      <w:pPr>
+        <w:numPr>
+          <w:ilvl w:val="0"/>
+          <w:numId w:val="2"/>
+        </w:numPr>
+        <w:rPr>
+          <w:rFonts w:ascii="Times New Roman" w:hAnsi="Times New Roman" w:cs="Times New Roman"/>
+          <w:lang w:val="es-CR"/>
+        </w:rPr>
+      </w:pPr>
+      <w:r>
+        <w:rPr>
+          <w:rFonts w:ascii="Times New Roman" w:hAnsi="Times New Roman" w:cs="Times New Roman"/>
+          <w:lang w:val="es-CR"/>
+        </w:rPr>
+        <w:t>Elaborar reportes y tablas dinámicas en Microsoft Excel, conectados al Data Warehouse, que permitan analizar el comportamiento de las ventas y los pagos por períodos, clientes, productos y vendedores, proporcionando información útil para la toma de decisiones.</w:t>
+      </w:r>
+    </w:p>
+    <w:p>
+      <w:pPr>
+        <w:ind w:firstLine="720"/>
+        <w:rPr>
+          <w:rFonts w:ascii="Times New Roman" w:hAnsi="Times New Roman" w:cs="Times New Roman"/>
+          <w:lang w:val="es-CR"/>
+        </w:rPr>
+      </w:pPr>
     </w:p>
     <w:p>
       <w:pPr>
@@ -735,7 +900,161 @@
     </w:p>
     <w:p>
       <w:pPr>
-        <w:pStyle w:val="Ttulo2"/>
+        <w:pStyle w:val="Heading2"/>
+        <w:rPr>
+          <w:rFonts w:ascii="Times New Roman" w:hAnsi="Times New Roman" w:cs="Times New Roman"/>
+          <w:b/>
+          <w:bCs/>
+          <w:color w:val="auto"/>
+        </w:rPr>
+      </w:pPr>
+      <w:r>
+        <w:rPr>
+          <w:rFonts w:ascii="Times New Roman" w:hAnsi="Times New Roman" w:cs="Times New Roman"/>
+          <w:b/>
+          <w:bCs/>
+          <w:color w:val="auto"/>
+        </w:rPr>
+        <w:lastRenderedPageBreak/>
+        <w:t>Diagrama del Modelo Dimensional</w:t>
+      </w:r>
+    </w:p>
+    <w:p>
+      <w:pPr>
+        <w:rPr>
+          <w:lang w:val="es-CR"/>
+        </w:rPr>
+      </w:pPr>
+      <w:r>
+        <w:rPr>
+          <w:lang w:val="es-CR"/>
+        </w:rPr>
+        <w:t>El Data Warehouse propuesto para Invacom Inc. S.A. utiliza un modelo dimensional de constelación de hechos, compuesto por dos tablas de hechos: FACT_VENTAS y FACT_PAGOS. Ambas comparten las dimensiones DIM_CLIENTE y DIM_FECHA, mientras que FACT_VENTAS se relaciona adicionalmente con DIM_PRODUCTO y DIM_VENDEDOR. Esta estructura permite analizar la información comercial y financiera desde diferentes perspectivas, facilitando la generación de reportes para la toma de decisiones.</w:t>
+      </w:r>
+    </w:p>
+    <w:p>
+      <w:pPr>
+        <w:rPr>
+          <w:lang w:val="es-CR"/>
+        </w:rPr>
+      </w:pPr>
+      <w:r>
+        <w:rPr>
+          <w:b/>
+          <w:bCs/>
+          <w:lang w:val="es-CR"/>
+        </w:rPr>
+        <w:t>Figura 1</w:t>
+      </w:r>
+    </w:p>
+    <w:p>
+      <w:pPr>
+        <w:rPr>
+          <w:i/>
+          <w:iCs/>
+          <w:lang w:val="es-CR"/>
+        </w:rPr>
+      </w:pPr>
+      <w:r>
+        <w:rPr>
+          <w:i/>
+          <w:iCs/>
+          <w:lang w:val="es-CR"/>
+        </w:rPr>
+        <w:t>Modelo dimensional del Data Warehouse de Invacom Inc. S.A.</w:t>
+      </w:r>
+    </w:p>
+    <w:p>
+      <w:pPr>
+        <w:rPr>
+          <w:lang w:val="es-CR"/>
+        </w:rPr>
+      </w:pPr>
+      <w:r>
+        <w:rPr>
+          <w:noProof/>
+        </w:rPr>
+        <w:drawing>
+          <wp:inline distT="0" distB="0" distL="0" distR="0" wp14:anchorId="043AB199" wp14:editId="5286B4FE">
+            <wp:extent cx="5731510" cy="5534025"/>
+            <wp:effectExtent l="0" t="0" r="2540" b="9525"/>
+            <wp:docPr id="186030684" name="Picture 1"/>
+            <wp:cNvGraphicFramePr>
+              <a:graphicFrameLocks xmlns:a="http://schemas.openxmlformats.org/drawingml/2006/main" noChangeAspect="1"/>
+            </wp:cNvGraphicFramePr>
+            <a:graphic xmlns:a="http://schemas.openxmlformats.org/drawingml/2006/main">
+              <a:graphicData uri="http://schemas.openxmlformats.org/drawingml/2006/picture">
+                <pic:pic xmlns:pic="http://schemas.openxmlformats.org/drawingml/2006/picture">
+                  <pic:nvPicPr>
+                    <pic:cNvPr id="0" name="Picture 1"/>
+                    <pic:cNvPicPr>
+                      <a:picLocks noChangeAspect="1" noChangeArrowheads="1"/>
+                    </pic:cNvPicPr>
+                  </pic:nvPicPr>
+                  <pic:blipFill>
+                    <a:blip r:embed="rId10" cstate="print">
+                      <a:extLst>
+                        <a:ext uri="{28A0092B-C50C-407E-A947-70E740481C1C}">
+                          <a14:useLocalDpi xmlns:a14="http://schemas.microsoft.com/office/drawing/2010/main" val="0"/>
+                        </a:ext>
+                      </a:extLst>
+                    </a:blip>
+                    <a:srcRect/>
+                    <a:stretch>
+                      <a:fillRect/>
+                    </a:stretch>
+                  </pic:blipFill>
+                  <pic:spPr bwMode="auto">
+                    <a:xfrm>
+                      <a:off x="0" y="0"/>
+                      <a:ext cx="5731510" cy="5534025"/>
+                    </a:xfrm>
+                    <a:prstGeom prst="rect">
+                      <a:avLst/>
+                    </a:prstGeom>
+                    <a:noFill/>
+                    <a:ln>
+                      <a:noFill/>
+                    </a:ln>
+                  </pic:spPr>
+                </pic:pic>
+              </a:graphicData>
+            </a:graphic>
+          </wp:inline>
+        </w:drawing>
+      </w:r>
+    </w:p>
+    <w:p>
+      <w:pPr>
+        <w:rPr>
+          <w:lang w:val="es-CR"/>
+        </w:rPr>
+      </w:pPr>
+      <w:r>
+        <w:rPr>
+          <w:i/>
+          <w:iCs/>
+          <w:lang w:val="es-CR"/>
+        </w:rPr>
+        <w:t>Nota.</w:t>
+      </w:r>
+      <w:r>
+        <w:rPr>
+          <w:lang w:val="es-CR"/>
+        </w:rPr>
+        <w:t xml:space="preserve"> Elaboración propia a partir de la base de datos Classic Models.</w:t>
+      </w:r>
+    </w:p>
+    <w:p>
+      <w:pPr>
+        <w:rPr>
+          <w:lang w:val="es-CR"/>
+        </w:rPr>
+      </w:pPr>
+    </w:p>
+    <w:p>
+      <w:pPr>
+        <w:pStyle w:val="Heading2"/>
         <w:rPr>
           <w:rFonts w:ascii="Times New Roman" w:hAnsi="Times New Roman" w:cs="Times New Roman"/>
           <w:b/>
@@ -763,33 +1082,11 @@
           <w:rFonts w:ascii="Times New Roman" w:hAnsi="Times New Roman" w:cs="Times New Roman"/>
         </w:rPr>
       </w:pPr>
-      <w:proofErr w:type="spellStart"/>
-      <w:r>
-        <w:rPr>
-          <w:rFonts w:ascii="Times New Roman" w:hAnsi="Times New Roman" w:cs="Times New Roman"/>
-        </w:rPr>
-        <w:t>Invacom</w:t>
-      </w:r>
-      <w:proofErr w:type="spellEnd"/>
-      <w:r>
-        <w:rPr>
-          <w:rFonts w:ascii="Times New Roman" w:hAnsi="Times New Roman" w:cs="Times New Roman"/>
-        </w:rPr>
-        <w:t xml:space="preserve"> </w:t>
-      </w:r>
-      <w:proofErr w:type="spellStart"/>
-      <w:r>
-        <w:rPr>
-          <w:rFonts w:ascii="Times New Roman" w:hAnsi="Times New Roman" w:cs="Times New Roman"/>
-        </w:rPr>
-        <w:t>Inc</w:t>
-      </w:r>
-      <w:proofErr w:type="spellEnd"/>
-      <w:r>
-        <w:rPr>
-          <w:rFonts w:ascii="Times New Roman" w:hAnsi="Times New Roman" w:cs="Times New Roman"/>
-        </w:rPr>
-        <w:t xml:space="preserve"> S.A. es una empresa planteada para el curso, y el grupo no tuvo acceso a usuarios reales para entrevistar. Los perfiles de usuario se definieron a partir de los puestos registrados en employees.csv y se validaron con el profesor del curso</w:t>
+      <w:r>
+        <w:rPr>
+          <w:rFonts w:ascii="Times New Roman" w:hAnsi="Times New Roman" w:cs="Times New Roman"/>
+        </w:rPr>
+        <w:t>Invacom Inc S.A. es una empresa planteada para el curso, y el grupo no tuvo acceso a usuarios reales para entrevistar. Los perfiles de usuario se definieron a partir de los puestos registrados en employees.csv y se validaron con el profesor del curso</w:t>
       </w:r>
       <w:r>
         <w:rPr>
@@ -1609,7 +1906,7 @@
     </w:tbl>
     <w:p>
       <w:pPr>
-        <w:pStyle w:val="Ttulo2"/>
+        <w:pStyle w:val="Heading2"/>
         <w:rPr>
           <w:rFonts w:ascii="Times New Roman" w:hAnsi="Times New Roman" w:cs="Times New Roman"/>
           <w:b/>
@@ -1766,63 +2063,7 @@
         <w:rPr>
           <w:rFonts w:ascii="Times New Roman" w:hAnsi="Times New Roman" w:cs="Times New Roman"/>
         </w:rPr>
-        <w:t>9. ¿Cuántos pedidos hay en cada estado (</w:t>
-      </w:r>
-      <w:proofErr w:type="spellStart"/>
-      <w:r>
-        <w:rPr>
-          <w:rFonts w:ascii="Times New Roman" w:hAnsi="Times New Roman" w:cs="Times New Roman"/>
-        </w:rPr>
-        <w:t>Shipped</w:t>
-      </w:r>
-      <w:proofErr w:type="spellEnd"/>
-      <w:r>
-        <w:rPr>
-          <w:rFonts w:ascii="Times New Roman" w:hAnsi="Times New Roman" w:cs="Times New Roman"/>
-        </w:rPr>
-        <w:t xml:space="preserve">, </w:t>
-      </w:r>
-      <w:proofErr w:type="spellStart"/>
-      <w:r>
-        <w:rPr>
-          <w:rFonts w:ascii="Times New Roman" w:hAnsi="Times New Roman" w:cs="Times New Roman"/>
-        </w:rPr>
-        <w:t>Cancelled</w:t>
-      </w:r>
-      <w:proofErr w:type="spellEnd"/>
-      <w:r>
-        <w:rPr>
-          <w:rFonts w:ascii="Times New Roman" w:hAnsi="Times New Roman" w:cs="Times New Roman"/>
-        </w:rPr>
-        <w:t xml:space="preserve">, </w:t>
-      </w:r>
-      <w:proofErr w:type="spellStart"/>
-      <w:r>
-        <w:rPr>
-          <w:rFonts w:ascii="Times New Roman" w:hAnsi="Times New Roman" w:cs="Times New Roman"/>
-        </w:rPr>
-        <w:t>On</w:t>
-      </w:r>
-      <w:proofErr w:type="spellEnd"/>
-      <w:r>
-        <w:rPr>
-          <w:rFonts w:ascii="Times New Roman" w:hAnsi="Times New Roman" w:cs="Times New Roman"/>
-        </w:rPr>
-        <w:t xml:space="preserve"> Hold, </w:t>
-      </w:r>
-      <w:proofErr w:type="spellStart"/>
-      <w:r>
-        <w:rPr>
-          <w:rFonts w:ascii="Times New Roman" w:hAnsi="Times New Roman" w:cs="Times New Roman"/>
-        </w:rPr>
-        <w:t>Disputed</w:t>
-      </w:r>
-      <w:proofErr w:type="spellEnd"/>
-      <w:r>
-        <w:rPr>
-          <w:rFonts w:ascii="Times New Roman" w:hAnsi="Times New Roman" w:cs="Times New Roman"/>
-        </w:rPr>
-        <w:t>, In Process y Resolved) y qué importe representa cada uno?</w:t>
+        <w:t>9. ¿Cuántos pedidos hay en cada estado (Shipped, Cancelled, On Hold, Disputed, In Process y Resolved) y qué importe representa cada uno?</w:t>
       </w:r>
     </w:p>
     <w:p>
@@ -1897,7 +2138,7 @@
     </w:p>
     <w:p>
       <w:pPr>
-        <w:pStyle w:val="Ttulo2"/>
+        <w:pStyle w:val="Heading2"/>
         <w:rPr>
           <w:rFonts w:ascii="Times New Roman" w:hAnsi="Times New Roman" w:cs="Times New Roman"/>
           <w:b/>
@@ -2327,7 +2568,6 @@
                 <w14:ligatures w14:val="none"/>
               </w:rPr>
             </w:pPr>
-            <w:proofErr w:type="spellStart"/>
             <w:r>
               <w:rPr>
                 <w:rFonts w:ascii="Times New Roman" w:eastAsia="Times New Roman" w:hAnsi="Times New Roman" w:cs="Times New Roman"/>
@@ -2337,7 +2577,6 @@
               </w:rPr>
               <w:t>customerNumber</w:t>
             </w:r>
-            <w:proofErr w:type="spellEnd"/>
           </w:p>
         </w:tc>
         <w:tc>
@@ -2496,7 +2735,6 @@
                 <w14:ligatures w14:val="none"/>
               </w:rPr>
             </w:pPr>
-            <w:proofErr w:type="spellStart"/>
             <w:r>
               <w:rPr>
                 <w:rFonts w:ascii="Times New Roman" w:eastAsia="Times New Roman" w:hAnsi="Times New Roman" w:cs="Times New Roman"/>
@@ -2506,7 +2744,6 @@
               </w:rPr>
               <w:t>employeeNumber</w:t>
             </w:r>
-            <w:proofErr w:type="spellEnd"/>
           </w:p>
         </w:tc>
         <w:tc>
@@ -2665,7 +2902,6 @@
                 <w14:ligatures w14:val="none"/>
               </w:rPr>
             </w:pPr>
-            <w:proofErr w:type="spellStart"/>
             <w:r>
               <w:rPr>
                 <w:rFonts w:ascii="Times New Roman" w:eastAsia="Times New Roman" w:hAnsi="Times New Roman" w:cs="Times New Roman"/>
@@ -2675,7 +2911,6 @@
               </w:rPr>
               <w:t>officeCode</w:t>
             </w:r>
-            <w:proofErr w:type="spellEnd"/>
           </w:p>
         </w:tc>
         <w:tc>
@@ -2834,7 +3069,6 @@
                 <w14:ligatures w14:val="none"/>
               </w:rPr>
             </w:pPr>
-            <w:proofErr w:type="spellStart"/>
             <w:r>
               <w:rPr>
                 <w:rFonts w:ascii="Times New Roman" w:eastAsia="Times New Roman" w:hAnsi="Times New Roman" w:cs="Times New Roman"/>
@@ -2844,7 +3078,6 @@
               </w:rPr>
               <w:t>orderNumber</w:t>
             </w:r>
-            <w:proofErr w:type="spellEnd"/>
           </w:p>
         </w:tc>
         <w:tc>
@@ -3003,37 +3236,15 @@
                 <w14:ligatures w14:val="none"/>
               </w:rPr>
             </w:pPr>
-            <w:proofErr w:type="spellStart"/>
-            <w:r>
-              <w:rPr>
-                <w:rFonts w:ascii="Times New Roman" w:eastAsia="Times New Roman" w:hAnsi="Times New Roman" w:cs="Times New Roman"/>
-                <w:kern w:val="0"/>
-                <w:lang w:eastAsia="es-ES"/>
-                <w14:ligatures w14:val="none"/>
-              </w:rPr>
-              <w:t>orderNumber</w:t>
-            </w:r>
-            <w:proofErr w:type="spellEnd"/>
-            <w:r>
-              <w:rPr>
-                <w:rFonts w:ascii="Times New Roman" w:eastAsia="Times New Roman" w:hAnsi="Times New Roman" w:cs="Times New Roman"/>
-                <w:kern w:val="0"/>
-                <w:lang w:eastAsia="es-ES"/>
-                <w14:ligatures w14:val="none"/>
-              </w:rPr>
-              <w:t xml:space="preserve"> y </w:t>
-            </w:r>
-            <w:proofErr w:type="spellStart"/>
-            <w:r>
-              <w:rPr>
-                <w:rFonts w:ascii="Times New Roman" w:eastAsia="Times New Roman" w:hAnsi="Times New Roman" w:cs="Times New Roman"/>
-                <w:kern w:val="0"/>
-                <w:lang w:eastAsia="es-ES"/>
-                <w14:ligatures w14:val="none"/>
-              </w:rPr>
-              <w:t>productCode</w:t>
-            </w:r>
-            <w:proofErr w:type="spellEnd"/>
+            <w:r>
+              <w:rPr>
+                <w:rFonts w:ascii="Times New Roman" w:eastAsia="Times New Roman" w:hAnsi="Times New Roman" w:cs="Times New Roman"/>
+                <w:kern w:val="0"/>
+                <w:lang w:eastAsia="es-ES"/>
+                <w14:ligatures w14:val="none"/>
+              </w:rPr>
+              <w:t>orderNumber y productCode</w:t>
+            </w:r>
           </w:p>
         </w:tc>
         <w:tc>
@@ -3192,7 +3403,6 @@
                 <w14:ligatures w14:val="none"/>
               </w:rPr>
             </w:pPr>
-            <w:proofErr w:type="spellStart"/>
             <w:r>
               <w:rPr>
                 <w:rFonts w:ascii="Times New Roman" w:eastAsia="Times New Roman" w:hAnsi="Times New Roman" w:cs="Times New Roman"/>
@@ -3202,7 +3412,6 @@
               </w:rPr>
               <w:t>productCode</w:t>
             </w:r>
-            <w:proofErr w:type="spellEnd"/>
           </w:p>
         </w:tc>
         <w:tc>
@@ -3361,7 +3570,6 @@
                 <w14:ligatures w14:val="none"/>
               </w:rPr>
             </w:pPr>
-            <w:proofErr w:type="spellStart"/>
             <w:r>
               <w:rPr>
                 <w:rFonts w:ascii="Times New Roman" w:eastAsia="Times New Roman" w:hAnsi="Times New Roman" w:cs="Times New Roman"/>
@@ -3371,7 +3579,6 @@
               </w:rPr>
               <w:t>productLine</w:t>
             </w:r>
-            <w:proofErr w:type="spellEnd"/>
           </w:p>
         </w:tc>
         <w:tc>
@@ -3530,37 +3737,15 @@
                 <w14:ligatures w14:val="none"/>
               </w:rPr>
             </w:pPr>
-            <w:proofErr w:type="spellStart"/>
-            <w:r>
-              <w:rPr>
-                <w:rFonts w:ascii="Times New Roman" w:eastAsia="Times New Roman" w:hAnsi="Times New Roman" w:cs="Times New Roman"/>
-                <w:kern w:val="0"/>
-                <w:lang w:eastAsia="es-ES"/>
-                <w14:ligatures w14:val="none"/>
-              </w:rPr>
-              <w:t>customerNumber</w:t>
-            </w:r>
-            <w:proofErr w:type="spellEnd"/>
-            <w:r>
-              <w:rPr>
-                <w:rFonts w:ascii="Times New Roman" w:eastAsia="Times New Roman" w:hAnsi="Times New Roman" w:cs="Times New Roman"/>
-                <w:kern w:val="0"/>
-                <w:lang w:eastAsia="es-ES"/>
-                <w14:ligatures w14:val="none"/>
-              </w:rPr>
-              <w:t xml:space="preserve"> y </w:t>
-            </w:r>
-            <w:proofErr w:type="spellStart"/>
-            <w:r>
-              <w:rPr>
-                <w:rFonts w:ascii="Times New Roman" w:eastAsia="Times New Roman" w:hAnsi="Times New Roman" w:cs="Times New Roman"/>
-                <w:kern w:val="0"/>
-                <w:lang w:eastAsia="es-ES"/>
-                <w14:ligatures w14:val="none"/>
-              </w:rPr>
-              <w:t>checkNumber</w:t>
-            </w:r>
-            <w:proofErr w:type="spellEnd"/>
+            <w:r>
+              <w:rPr>
+                <w:rFonts w:ascii="Times New Roman" w:eastAsia="Times New Roman" w:hAnsi="Times New Roman" w:cs="Times New Roman"/>
+                <w:kern w:val="0"/>
+                <w:lang w:eastAsia="es-ES"/>
+                <w14:ligatures w14:val="none"/>
+              </w:rPr>
+              <w:t>customerNumber y checkNumber</w:t>
+            </w:r>
           </w:p>
         </w:tc>
         <w:tc>
@@ -3607,23 +3792,7 @@
         <w:ind w:firstLine="720"/>
       </w:pPr>
       <w:r>
-        <w:t xml:space="preserve">Los archivos se relacionan mediante claves foráneas. Cada línea de orderdetails.csv pertenece a un pedido de orders.csv y a un producto de products.csv. Cada pedido pertenece a un cliente, y cada cliente puede tener un representante de ventas asignado en </w:t>
-      </w:r>
-      <w:proofErr w:type="spellStart"/>
-      <w:r>
-        <w:t>salesRepEmployeeNumber</w:t>
-      </w:r>
-      <w:proofErr w:type="spellEnd"/>
-      <w:r>
-        <w:t xml:space="preserve">, que corresponde a un empleado de employees.csv. Cada empleado trabaja en una oficina de offices.csv y reporta a otro empleado mediante </w:t>
-      </w:r>
-      <w:proofErr w:type="spellStart"/>
-      <w:r>
-        <w:t>reportsTo</w:t>
-      </w:r>
-      <w:proofErr w:type="spellEnd"/>
-      <w:r>
-        <w:t xml:space="preserve">. </w:t>
+        <w:t xml:space="preserve">Los archivos se relacionan mediante claves foráneas. Cada línea de orderdetails.csv pertenece a un pedido de orders.csv y a un producto de products.csv. Cada pedido pertenece a un cliente, y cada cliente puede tener un representante de ventas asignado en salesRepEmployeeNumber, que corresponde a un empleado de employees.csv. Cada empleado trabaja en una oficina de offices.csv y reporta a otro empleado mediante reportsTo. </w:t>
       </w:r>
       <w:r>
         <w:lastRenderedPageBreak/>
@@ -3641,7 +3810,7 @@
     </w:p>
     <w:p>
       <w:pPr>
-        <w:pStyle w:val="Ttulo2"/>
+        <w:pStyle w:val="Heading2"/>
         <w:rPr>
           <w:rFonts w:ascii="Times New Roman" w:hAnsi="Times New Roman" w:cs="Times New Roman"/>
           <w:b/>
@@ -3670,21 +3839,7 @@
         <w:rPr>
           <w:rFonts w:ascii="Times New Roman" w:hAnsi="Times New Roman" w:cs="Times New Roman"/>
         </w:rPr>
-        <w:t xml:space="preserve">El grupo revisó la calidad de los ocho archivos con un script de Python y con la vista previa de Pentaho Data </w:t>
-      </w:r>
-      <w:proofErr w:type="spellStart"/>
-      <w:r>
-        <w:rPr>
-          <w:rFonts w:ascii="Times New Roman" w:hAnsi="Times New Roman" w:cs="Times New Roman"/>
-        </w:rPr>
-        <w:t>Integration</w:t>
-      </w:r>
-      <w:proofErr w:type="spellEnd"/>
-      <w:r>
-        <w:rPr>
-          <w:rFonts w:ascii="Times New Roman" w:hAnsi="Times New Roman" w:cs="Times New Roman"/>
-        </w:rPr>
-        <w:t>. Se buscaron valores nulos, registros duplicados, formatos inconsistentes, errores de escritura y registros sin relación con otras tablas. La tabla 3 resume los problemas encontrados y el tratamiento propuesto para cada uno en el proceso ETL.</w:t>
+        <w:t>El grupo revisó la calidad de los ocho archivos con un script de Python y con la vista previa de Pentaho Data Integration. Se buscaron valores nulos, registros duplicados, formatos inconsistentes, errores de escritura y registros sin relación con otras tablas. La tabla 3 resume los problemas encontrados y el tratamiento propuesto para cada uno en el proceso ETL.</w:t>
       </w:r>
     </w:p>
     <w:p>
@@ -5836,21 +5991,7 @@
         <w:rPr>
           <w:rFonts w:ascii="Times New Roman" w:hAnsi="Times New Roman" w:cs="Times New Roman"/>
         </w:rPr>
-        <w:t xml:space="preserve">El tratamiento de los pedidos cancelados queda pendiente de definir con el profesor del curso, que actúa como </w:t>
-      </w:r>
-      <w:proofErr w:type="spellStart"/>
-      <w:r>
-        <w:rPr>
-          <w:rFonts w:ascii="Times New Roman" w:hAnsi="Times New Roman" w:cs="Times New Roman"/>
-        </w:rPr>
-        <w:t>Product</w:t>
-      </w:r>
-      <w:proofErr w:type="spellEnd"/>
-      <w:r>
-        <w:rPr>
-          <w:rFonts w:ascii="Times New Roman" w:hAnsi="Times New Roman" w:cs="Times New Roman"/>
-        </w:rPr>
-        <w:t xml:space="preserve"> Owner del proyecto.</w:t>
+        <w:t>El tratamiento de los pedidos cancelados queda pendiente de definir con el profesor del curso, que actúa como Product Owner del proyecto.</w:t>
       </w:r>
     </w:p>
     <w:p>
@@ -5872,7 +6013,7 @@
     </w:p>
     <w:p>
       <w:pPr>
-        <w:pStyle w:val="Ttulo2"/>
+        <w:pStyle w:val="Heading2"/>
         <w:jc w:val="center"/>
         <w:rPr>
           <w:rFonts w:ascii="Times New Roman" w:hAnsi="Times New Roman" w:cs="Times New Roman"/>
@@ -5923,7 +6064,7 @@
       </w:r>
     </w:p>
     <w:sectPr>
-      <w:headerReference w:type="default" r:id="rId9"/>
+      <w:headerReference w:type="default" r:id="rId11"/>
       <w:pgSz w:w="11906" w:h="16838"/>
       <w:pgMar w:top="1440" w:right="1440" w:bottom="1440" w:left="1440" w:header="709" w:footer="709" w:gutter="0"/>
       <w:cols w:space="708"/>
@@ -5996,7 +6137,7 @@
     <w:sdtContent>
       <w:p>
         <w:pPr>
-          <w:pStyle w:val="Encabezado"/>
+          <w:pStyle w:val="Header"/>
           <w:jc w:val="right"/>
         </w:pPr>
         <w:r>
@@ -6022,10 +6163,247 @@
   </w:sdt>
   <w:p>
     <w:pPr>
-      <w:pStyle w:val="Encabezado"/>
+      <w:pStyle w:val="Header"/>
     </w:pPr>
   </w:p>
 </w:hdr>
+</file>
+
+<file path=word/numbering.xml><?xml version="1.0" encoding="utf-8"?>
+<w:numbering xmlns:wpc="http://schemas.microsoft.com/office/word/2010/wordprocessingCanvas" xmlns:cx="http://schemas.microsoft.com/office/drawing/2014/chartex" xmlns:cx1="http://schemas.microsoft.com/office/drawing/2015/9/8/chartex" xmlns:cx2="http://schemas.microsoft.com/office/drawing/2015/10/21/chartex" xmlns:cx3="http://schemas.microsoft.com/office/drawing/2016/5/9/chartex" xmlns:cx4="http://schemas.microsoft.com/office/drawing/2016/5/10/chartex" xmlns:cx5="http://schemas.microsoft.com/office/drawing/2016/5/11/chartex" xmlns:cx6="http://schemas.microsoft.com/office/drawing/2016/5/12/chartex" xmlns:cx7="http://schemas.microsoft.com/office/drawing/2016/5/13/chartex" xmlns:cx8="http://schemas.microsoft.com/office/drawing/2016/5/14/chartex" xmlns:mc="http://schemas.openxmlformats.org/markup-compatibility/2006" xmlns:aink="http://schemas.microsoft.com/office/drawing/2016/ink" xmlns:am3d="http://schemas.microsoft.com/office/drawing/2017/model3d" xmlns:o="urn:schemas-microsoft-com:office:office" xmlns:oel="http://schemas.microsoft.com/office/2019/extlst" xmlns:r="http://schemas.openxmlformats.org/officeDocument/2006/relationships" xmlns:m="http://schemas.openxmlformats.org/officeDocument/2006/math" xmlns:v="urn:schemas-microsoft-com:vml" xmlns:wp14="http://schemas.microsoft.com/office/word/2010/wordprocessingDrawing" xmlns:wp="http://schemas.openxmlformats.org/drawingml/2006/wordprocessingDrawing" xmlns:w10="urn:schemas-microsoft-com:office:word" xmlns:w="http://schemas.openxmlformats.org/wordprocessingml/2006/main" xmlns:w14="http://schemas.microsoft.com/office/word/2010/wordml" xmlns:w15="http://schemas.microsoft.com/office/word/2012/wordml" xmlns:w16cex="http://schemas.microsoft.com/office/word/2018/wordml/cex" xmlns:w16cid="http://schemas.microsoft.com/office/word/2016/wordml/cid" xmlns:w16="http://schemas.microsoft.com/office/word/2018/wordml" xmlns:w16du="http://schemas.microsoft.com/office/word/2023/wordml/word16du" xmlns:w16sdtdh="http://schemas.microsoft.com/office/word/2020/wordml/sdtdatahash" xmlns:w16sdtfl="http://schemas.microsoft.com/office/word/2024/wordml/sdtformatlock" xmlns:w16se="http://schemas.microsoft.com/office/word/2015/wordml/symex" xmlns:wpg="http://schemas.microsoft.com/office/word/2010/wordprocessingGroup" xmlns:wpi="http://schemas.microsoft.com/office/word/2010/wordprocessingInk" xmlns:wne="http://schemas.microsoft.com/office/word/2006/wordml" xmlns:wps="http://schemas.microsoft.com/office/word/2010/wordprocessingShape" mc:Ignorable="w14 w15 w16se w16cid w16 w16cex w16sdtdh w16sdtfl w16du wp14">
+  <w:abstractNum w:abstractNumId="0" w15:restartNumberingAfterBreak="0">
+    <w:nsid w:val="17D92800"/>
+    <w:multiLevelType w:val="multilevel"/>
+    <w:tmpl w:val="9236CD12"/>
+    <w:lvl w:ilvl="0">
+      <w:start w:val="1"/>
+      <w:numFmt w:val="decimal"/>
+      <w:lvlText w:val="%1."/>
+      <w:lvlJc w:val="left"/>
+      <w:pPr>
+        <w:tabs>
+          <w:tab w:val="num" w:pos="720"/>
+        </w:tabs>
+        <w:ind w:left="720" w:hanging="360"/>
+      </w:pPr>
+    </w:lvl>
+    <w:lvl w:ilvl="1" w:tentative="1">
+      <w:start w:val="1"/>
+      <w:numFmt w:val="decimal"/>
+      <w:lvlText w:val="%2."/>
+      <w:lvlJc w:val="left"/>
+      <w:pPr>
+        <w:tabs>
+          <w:tab w:val="num" w:pos="1440"/>
+        </w:tabs>
+        <w:ind w:left="1440" w:hanging="360"/>
+      </w:pPr>
+    </w:lvl>
+    <w:lvl w:ilvl="2" w:tentative="1">
+      <w:start w:val="1"/>
+      <w:numFmt w:val="decimal"/>
+      <w:lvlText w:val="%3."/>
+      <w:lvlJc w:val="left"/>
+      <w:pPr>
+        <w:tabs>
+          <w:tab w:val="num" w:pos="2160"/>
+        </w:tabs>
+        <w:ind w:left="2160" w:hanging="360"/>
+      </w:pPr>
+    </w:lvl>
+    <w:lvl w:ilvl="3" w:tentative="1">
+      <w:start w:val="1"/>
+      <w:numFmt w:val="decimal"/>
+      <w:lvlText w:val="%4."/>
+      <w:lvlJc w:val="left"/>
+      <w:pPr>
+        <w:tabs>
+          <w:tab w:val="num" w:pos="2880"/>
+        </w:tabs>
+        <w:ind w:left="2880" w:hanging="360"/>
+      </w:pPr>
+    </w:lvl>
+    <w:lvl w:ilvl="4" w:tentative="1">
+      <w:start w:val="1"/>
+      <w:numFmt w:val="decimal"/>
+      <w:lvlText w:val="%5."/>
+      <w:lvlJc w:val="left"/>
+      <w:pPr>
+        <w:tabs>
+          <w:tab w:val="num" w:pos="3600"/>
+        </w:tabs>
+        <w:ind w:left="3600" w:hanging="360"/>
+      </w:pPr>
+    </w:lvl>
+    <w:lvl w:ilvl="5" w:tentative="1">
+      <w:start w:val="1"/>
+      <w:numFmt w:val="decimal"/>
+      <w:lvlText w:val="%6."/>
+      <w:lvlJc w:val="left"/>
+      <w:pPr>
+        <w:tabs>
+          <w:tab w:val="num" w:pos="4320"/>
+        </w:tabs>
+        <w:ind w:left="4320" w:hanging="360"/>
+      </w:pPr>
+    </w:lvl>
+    <w:lvl w:ilvl="6" w:tentative="1">
+      <w:start w:val="1"/>
+      <w:numFmt w:val="decimal"/>
+      <w:lvlText w:val="%7."/>
+      <w:lvlJc w:val="left"/>
+      <w:pPr>
+        <w:tabs>
+          <w:tab w:val="num" w:pos="5040"/>
+        </w:tabs>
+        <w:ind w:left="5040" w:hanging="360"/>
+      </w:pPr>
+    </w:lvl>
+    <w:lvl w:ilvl="7" w:tentative="1">
+      <w:start w:val="1"/>
+      <w:numFmt w:val="decimal"/>
+      <w:lvlText w:val="%8."/>
+      <w:lvlJc w:val="left"/>
+      <w:pPr>
+        <w:tabs>
+          <w:tab w:val="num" w:pos="5760"/>
+        </w:tabs>
+        <w:ind w:left="5760" w:hanging="360"/>
+      </w:pPr>
+    </w:lvl>
+    <w:lvl w:ilvl="8" w:tentative="1">
+      <w:start w:val="1"/>
+      <w:numFmt w:val="decimal"/>
+      <w:lvlText w:val="%9."/>
+      <w:lvlJc w:val="left"/>
+      <w:pPr>
+        <w:tabs>
+          <w:tab w:val="num" w:pos="6480"/>
+        </w:tabs>
+        <w:ind w:left="6480" w:hanging="360"/>
+      </w:pPr>
+    </w:lvl>
+  </w:abstractNum>
+  <w:abstractNum w:abstractNumId="1" w15:restartNumberingAfterBreak="0">
+    <w:nsid w:val="76A03707"/>
+    <w:multiLevelType w:val="multilevel"/>
+    <w:tmpl w:val="5D84E88E"/>
+    <w:lvl w:ilvl="0">
+      <w:start w:val="1"/>
+      <w:numFmt w:val="decimal"/>
+      <w:lvlText w:val="%1."/>
+      <w:lvlJc w:val="left"/>
+      <w:pPr>
+        <w:tabs>
+          <w:tab w:val="num" w:pos="720"/>
+        </w:tabs>
+        <w:ind w:left="720" w:hanging="360"/>
+      </w:pPr>
+    </w:lvl>
+    <w:lvl w:ilvl="1" w:tentative="1">
+      <w:start w:val="1"/>
+      <w:numFmt w:val="decimal"/>
+      <w:lvlText w:val="%2."/>
+      <w:lvlJc w:val="left"/>
+      <w:pPr>
+        <w:tabs>
+          <w:tab w:val="num" w:pos="1440"/>
+        </w:tabs>
+        <w:ind w:left="1440" w:hanging="360"/>
+      </w:pPr>
+    </w:lvl>
+    <w:lvl w:ilvl="2" w:tentative="1">
+      <w:start w:val="1"/>
+      <w:numFmt w:val="decimal"/>
+      <w:lvlText w:val="%3."/>
+      <w:lvlJc w:val="left"/>
+      <w:pPr>
+        <w:tabs>
+          <w:tab w:val="num" w:pos="2160"/>
+        </w:tabs>
+        <w:ind w:left="2160" w:hanging="360"/>
+      </w:pPr>
+    </w:lvl>
+    <w:lvl w:ilvl="3" w:tentative="1">
+      <w:start w:val="1"/>
+      <w:numFmt w:val="decimal"/>
+      <w:lvlText w:val="%4."/>
+      <w:lvlJc w:val="left"/>
+      <w:pPr>
+        <w:tabs>
+          <w:tab w:val="num" w:pos="2880"/>
+        </w:tabs>
+        <w:ind w:left="2880" w:hanging="360"/>
+      </w:pPr>
+    </w:lvl>
+    <w:lvl w:ilvl="4" w:tentative="1">
+      <w:start w:val="1"/>
+      <w:numFmt w:val="decimal"/>
+      <w:lvlText w:val="%5."/>
+      <w:lvlJc w:val="left"/>
+      <w:pPr>
+        <w:tabs>
+          <w:tab w:val="num" w:pos="3600"/>
+        </w:tabs>
+        <w:ind w:left="3600" w:hanging="360"/>
+      </w:pPr>
+    </w:lvl>
+    <w:lvl w:ilvl="5" w:tentative="1">
+      <w:start w:val="1"/>
+      <w:numFmt w:val="decimal"/>
+      <w:lvlText w:val="%6."/>
+      <w:lvlJc w:val="left"/>
+      <w:pPr>
+        <w:tabs>
+          <w:tab w:val="num" w:pos="4320"/>
+        </w:tabs>
+        <w:ind w:left="4320" w:hanging="360"/>
+      </w:pPr>
+    </w:lvl>
+    <w:lvl w:ilvl="6" w:tentative="1">
+      <w:start w:val="1"/>
+      <w:numFmt w:val="decimal"/>
+      <w:lvlText w:val="%7."/>
+      <w:lvlJc w:val="left"/>
+      <w:pPr>
+        <w:tabs>
+          <w:tab w:val="num" w:pos="5040"/>
+        </w:tabs>
+        <w:ind w:left="5040" w:hanging="360"/>
+      </w:pPr>
+    </w:lvl>
+    <w:lvl w:ilvl="7" w:tentative="1">
+      <w:start w:val="1"/>
+      <w:numFmt w:val="decimal"/>
+      <w:lvlText w:val="%8."/>
+      <w:lvlJc w:val="left"/>
+      <w:pPr>
+        <w:tabs>
+          <w:tab w:val="num" w:pos="5760"/>
+        </w:tabs>
+        <w:ind w:left="5760" w:hanging="360"/>
+      </w:pPr>
+    </w:lvl>
+    <w:lvl w:ilvl="8" w:tentative="1">
+      <w:start w:val="1"/>
+      <w:numFmt w:val="decimal"/>
+      <w:lvlText w:val="%9."/>
+      <w:lvlJc w:val="left"/>
+      <w:pPr>
+        <w:tabs>
+          <w:tab w:val="num" w:pos="6480"/>
+        </w:tabs>
+        <w:ind w:left="6480" w:hanging="360"/>
+      </w:pPr>
+    </w:lvl>
+  </w:abstractNum>
+  <w:num w:numId="1" w16cid:durableId="368606698">
+    <w:abstractNumId w:val="1"/>
+  </w:num>
+  <w:num w:numId="2" w16cid:durableId="1672685846">
+    <w:abstractNumId w:val="0"/>
+  </w:num>
+</w:numbering>
 </file>
 
 <file path=word/styles.xml><?xml version="1.0" encoding="utf-8"?>
@@ -6429,11 +6807,11 @@
     <w:name w:val="Normal"/>
     <w:qFormat/>
   </w:style>
-  <w:style w:type="paragraph" w:styleId="Ttulo1">
+  <w:style w:type="paragraph" w:styleId="Heading1">
     <w:name w:val="heading 1"/>
     <w:basedOn w:val="Normal"/>
     <w:next w:val="Normal"/>
-    <w:link w:val="Ttulo1Car"/>
+    <w:link w:val="Heading1Char"/>
     <w:uiPriority w:val="9"/>
     <w:qFormat/>
     <w:rsid w:val="00496B28"/>
@@ -6450,11 +6828,11 @@
       <w:szCs w:val="40"/>
     </w:rPr>
   </w:style>
-  <w:style w:type="paragraph" w:styleId="Ttulo2">
+  <w:style w:type="paragraph" w:styleId="Heading2">
     <w:name w:val="heading 2"/>
     <w:basedOn w:val="Normal"/>
     <w:next w:val="Normal"/>
-    <w:link w:val="Ttulo2Car"/>
+    <w:link w:val="Heading2Char"/>
     <w:uiPriority w:val="9"/>
     <w:unhideWhenUsed/>
     <w:qFormat/>
@@ -6472,11 +6850,11 @@
       <w:szCs w:val="32"/>
     </w:rPr>
   </w:style>
-  <w:style w:type="paragraph" w:styleId="Ttulo3">
+  <w:style w:type="paragraph" w:styleId="Heading3">
     <w:name w:val="heading 3"/>
     <w:basedOn w:val="Normal"/>
     <w:next w:val="Normal"/>
-    <w:link w:val="Ttulo3Car"/>
+    <w:link w:val="Heading3Char"/>
     <w:uiPriority w:val="9"/>
     <w:semiHidden/>
     <w:unhideWhenUsed/>
@@ -6495,11 +6873,11 @@
       <w:szCs w:val="28"/>
     </w:rPr>
   </w:style>
-  <w:style w:type="paragraph" w:styleId="Ttulo4">
+  <w:style w:type="paragraph" w:styleId="Heading4">
     <w:name w:val="heading 4"/>
     <w:basedOn w:val="Normal"/>
     <w:next w:val="Normal"/>
-    <w:link w:val="Ttulo4Car"/>
+    <w:link w:val="Heading4Char"/>
     <w:uiPriority w:val="9"/>
     <w:semiHidden/>
     <w:unhideWhenUsed/>
@@ -6518,11 +6896,11 @@
       <w:color w:val="0F4761" w:themeColor="accent1" w:themeShade="BF"/>
     </w:rPr>
   </w:style>
-  <w:style w:type="paragraph" w:styleId="Ttulo5">
+  <w:style w:type="paragraph" w:styleId="Heading5">
     <w:name w:val="heading 5"/>
     <w:basedOn w:val="Normal"/>
     <w:next w:val="Normal"/>
-    <w:link w:val="Ttulo5Car"/>
+    <w:link w:val="Heading5Char"/>
     <w:uiPriority w:val="9"/>
     <w:semiHidden/>
     <w:unhideWhenUsed/>
@@ -6539,11 +6917,11 @@
       <w:color w:val="0F4761" w:themeColor="accent1" w:themeShade="BF"/>
     </w:rPr>
   </w:style>
-  <w:style w:type="paragraph" w:styleId="Ttulo6">
+  <w:style w:type="paragraph" w:styleId="Heading6">
     <w:name w:val="heading 6"/>
     <w:basedOn w:val="Normal"/>
     <w:next w:val="Normal"/>
-    <w:link w:val="Ttulo6Car"/>
+    <w:link w:val="Heading6Char"/>
     <w:uiPriority w:val="9"/>
     <w:semiHidden/>
     <w:unhideWhenUsed/>
@@ -6562,11 +6940,11 @@
       <w:color w:val="595959" w:themeColor="text1" w:themeTint="A6"/>
     </w:rPr>
   </w:style>
-  <w:style w:type="paragraph" w:styleId="Ttulo7">
+  <w:style w:type="paragraph" w:styleId="Heading7">
     <w:name w:val="heading 7"/>
     <w:basedOn w:val="Normal"/>
     <w:next w:val="Normal"/>
-    <w:link w:val="Ttulo7Car"/>
+    <w:link w:val="Heading7Char"/>
     <w:uiPriority w:val="9"/>
     <w:semiHidden/>
     <w:unhideWhenUsed/>
@@ -6583,11 +6961,11 @@
       <w:color w:val="595959" w:themeColor="text1" w:themeTint="A6"/>
     </w:rPr>
   </w:style>
-  <w:style w:type="paragraph" w:styleId="Ttulo8">
+  <w:style w:type="paragraph" w:styleId="Heading8">
     <w:name w:val="heading 8"/>
     <w:basedOn w:val="Normal"/>
     <w:next w:val="Normal"/>
-    <w:link w:val="Ttulo8Car"/>
+    <w:link w:val="Heading8Char"/>
     <w:uiPriority w:val="9"/>
     <w:semiHidden/>
     <w:unhideWhenUsed/>
@@ -6606,11 +6984,11 @@
       <w:color w:val="272727" w:themeColor="text1" w:themeTint="D8"/>
     </w:rPr>
   </w:style>
-  <w:style w:type="paragraph" w:styleId="Ttulo9">
+  <w:style w:type="paragraph" w:styleId="Heading9">
     <w:name w:val="heading 9"/>
     <w:basedOn w:val="Normal"/>
     <w:next w:val="Normal"/>
-    <w:link w:val="Ttulo9Car"/>
+    <w:link w:val="Heading9Char"/>
     <w:uiPriority w:val="9"/>
     <w:semiHidden/>
     <w:unhideWhenUsed/>
@@ -6627,12 +7005,12 @@
       <w:color w:val="272727" w:themeColor="text1" w:themeTint="D8"/>
     </w:rPr>
   </w:style>
-  <w:style w:type="character" w:default="1" w:styleId="Fuentedeprrafopredeter">
+  <w:style w:type="character" w:default="1" w:styleId="DefaultParagraphFont">
     <w:name w:val="Default Paragraph Font"/>
     <w:uiPriority w:val="1"/>
     <w:unhideWhenUsed/>
   </w:style>
-  <w:style w:type="table" w:default="1" w:styleId="Tablanormal">
+  <w:style w:type="table" w:default="1" w:styleId="TableNormal">
     <w:name w:val="Normal Table"/>
     <w:uiPriority w:val="99"/>
     <w:semiHidden/>
@@ -6647,16 +7025,16 @@
       </w:tblCellMar>
     </w:tblPr>
   </w:style>
-  <w:style w:type="numbering" w:default="1" w:styleId="Sinlista">
+  <w:style w:type="numbering" w:default="1" w:styleId="NoList">
     <w:name w:val="No List"/>
     <w:uiPriority w:val="99"/>
     <w:semiHidden/>
     <w:unhideWhenUsed/>
   </w:style>
-  <w:style w:type="character" w:customStyle="1" w:styleId="Ttulo1Car">
-    <w:name w:val="Título 1 Car"/>
-    <w:basedOn w:val="Fuentedeprrafopredeter"/>
-    <w:link w:val="Ttulo1"/>
+  <w:style w:type="character" w:customStyle="1" w:styleId="Heading1Char">
+    <w:name w:val="Heading 1 Char"/>
+    <w:basedOn w:val="DefaultParagraphFont"/>
+    <w:link w:val="Heading1"/>
     <w:uiPriority w:val="9"/>
     <w:rsid w:val="00496B28"/>
     <w:rPr>
@@ -6666,10 +7044,10 @@
       <w:szCs w:val="40"/>
     </w:rPr>
   </w:style>
-  <w:style w:type="character" w:customStyle="1" w:styleId="Ttulo2Car">
-    <w:name w:val="Título 2 Car"/>
-    <w:basedOn w:val="Fuentedeprrafopredeter"/>
-    <w:link w:val="Ttulo2"/>
+  <w:style w:type="character" w:customStyle="1" w:styleId="Heading2Char">
+    <w:name w:val="Heading 2 Char"/>
+    <w:basedOn w:val="DefaultParagraphFont"/>
+    <w:link w:val="Heading2"/>
     <w:uiPriority w:val="9"/>
     <w:rsid w:val="00496B28"/>
     <w:rPr>
@@ -6679,10 +7057,10 @@
       <w:szCs w:val="32"/>
     </w:rPr>
   </w:style>
-  <w:style w:type="character" w:customStyle="1" w:styleId="Ttulo3Car">
-    <w:name w:val="Título 3 Car"/>
-    <w:basedOn w:val="Fuentedeprrafopredeter"/>
-    <w:link w:val="Ttulo3"/>
+  <w:style w:type="character" w:customStyle="1" w:styleId="Heading3Char">
+    <w:name w:val="Heading 3 Char"/>
+    <w:basedOn w:val="DefaultParagraphFont"/>
+    <w:link w:val="Heading3"/>
     <w:uiPriority w:val="9"/>
     <w:semiHidden/>
     <w:rsid w:val="00496B28"/>
@@ -6693,10 +7071,10 @@
       <w:szCs w:val="28"/>
     </w:rPr>
   </w:style>
-  <w:style w:type="character" w:customStyle="1" w:styleId="Ttulo4Car">
-    <w:name w:val="Título 4 Car"/>
-    <w:basedOn w:val="Fuentedeprrafopredeter"/>
-    <w:link w:val="Ttulo4"/>
+  <w:style w:type="character" w:customStyle="1" w:styleId="Heading4Char">
+    <w:name w:val="Heading 4 Char"/>
+    <w:basedOn w:val="DefaultParagraphFont"/>
+    <w:link w:val="Heading4"/>
     <w:uiPriority w:val="9"/>
     <w:semiHidden/>
     <w:rsid w:val="00496B28"/>
@@ -6707,10 +7085,10 @@
       <w:color w:val="0F4761" w:themeColor="accent1" w:themeShade="BF"/>
     </w:rPr>
   </w:style>
-  <w:style w:type="character" w:customStyle="1" w:styleId="Ttulo5Car">
-    <w:name w:val="Título 5 Car"/>
-    <w:basedOn w:val="Fuentedeprrafopredeter"/>
-    <w:link w:val="Ttulo5"/>
+  <w:style w:type="character" w:customStyle="1" w:styleId="Heading5Char">
+    <w:name w:val="Heading 5 Char"/>
+    <w:basedOn w:val="DefaultParagraphFont"/>
+    <w:link w:val="Heading5"/>
     <w:uiPriority w:val="9"/>
     <w:semiHidden/>
     <w:rsid w:val="00496B28"/>
@@ -6719,10 +7097,10 @@
       <w:color w:val="0F4761" w:themeColor="accent1" w:themeShade="BF"/>
     </w:rPr>
   </w:style>
-  <w:style w:type="character" w:customStyle="1" w:styleId="Ttulo6Car">
-    <w:name w:val="Título 6 Car"/>
-    <w:basedOn w:val="Fuentedeprrafopredeter"/>
-    <w:link w:val="Ttulo6"/>
+  <w:style w:type="character" w:customStyle="1" w:styleId="Heading6Char">
+    <w:name w:val="Heading 6 Char"/>
+    <w:basedOn w:val="DefaultParagraphFont"/>
+    <w:link w:val="Heading6"/>
     <w:uiPriority w:val="9"/>
     <w:semiHidden/>
     <w:rsid w:val="00496B28"/>
@@ -6733,10 +7111,10 @@
       <w:color w:val="595959" w:themeColor="text1" w:themeTint="A6"/>
     </w:rPr>
   </w:style>
-  <w:style w:type="character" w:customStyle="1" w:styleId="Ttulo7Car">
-    <w:name w:val="Título 7 Car"/>
-    <w:basedOn w:val="Fuentedeprrafopredeter"/>
-    <w:link w:val="Ttulo7"/>
+  <w:style w:type="character" w:customStyle="1" w:styleId="Heading7Char">
+    <w:name w:val="Heading 7 Char"/>
+    <w:basedOn w:val="DefaultParagraphFont"/>
+    <w:link w:val="Heading7"/>
     <w:uiPriority w:val="9"/>
     <w:semiHidden/>
     <w:rsid w:val="00496B28"/>
@@ -6745,10 +7123,10 @@
       <w:color w:val="595959" w:themeColor="text1" w:themeTint="A6"/>
     </w:rPr>
   </w:style>
-  <w:style w:type="character" w:customStyle="1" w:styleId="Ttulo8Car">
-    <w:name w:val="Título 8 Car"/>
-    <w:basedOn w:val="Fuentedeprrafopredeter"/>
-    <w:link w:val="Ttulo8"/>
+  <w:style w:type="character" w:customStyle="1" w:styleId="Heading8Char">
+    <w:name w:val="Heading 8 Char"/>
+    <w:basedOn w:val="DefaultParagraphFont"/>
+    <w:link w:val="Heading8"/>
     <w:uiPriority w:val="9"/>
     <w:semiHidden/>
     <w:rsid w:val="00496B28"/>
@@ -6759,10 +7137,10 @@
       <w:color w:val="272727" w:themeColor="text1" w:themeTint="D8"/>
     </w:rPr>
   </w:style>
-  <w:style w:type="character" w:customStyle="1" w:styleId="Ttulo9Car">
-    <w:name w:val="Título 9 Car"/>
-    <w:basedOn w:val="Fuentedeprrafopredeter"/>
-    <w:link w:val="Ttulo9"/>
+  <w:style w:type="character" w:customStyle="1" w:styleId="Heading9Char">
+    <w:name w:val="Heading 9 Char"/>
+    <w:basedOn w:val="DefaultParagraphFont"/>
+    <w:link w:val="Heading9"/>
     <w:uiPriority w:val="9"/>
     <w:semiHidden/>
     <w:rsid w:val="00496B28"/>
@@ -6771,11 +7149,11 @@
       <w:color w:val="272727" w:themeColor="text1" w:themeTint="D8"/>
     </w:rPr>
   </w:style>
-  <w:style w:type="paragraph" w:styleId="Ttulo">
+  <w:style w:type="paragraph" w:styleId="Title">
     <w:name w:val="Title"/>
     <w:basedOn w:val="Normal"/>
     <w:next w:val="Normal"/>
-    <w:link w:val="TtuloCar"/>
+    <w:link w:val="TitleChar"/>
     <w:uiPriority w:val="10"/>
     <w:qFormat/>
     <w:rsid w:val="00496B28"/>
@@ -6791,10 +7169,10 @@
       <w:szCs w:val="56"/>
     </w:rPr>
   </w:style>
-  <w:style w:type="character" w:customStyle="1" w:styleId="TtuloCar">
-    <w:name w:val="Título Car"/>
-    <w:basedOn w:val="Fuentedeprrafopredeter"/>
-    <w:link w:val="Ttulo"/>
+  <w:style w:type="character" w:customStyle="1" w:styleId="TitleChar">
+    <w:name w:val="Title Char"/>
+    <w:basedOn w:val="DefaultParagraphFont"/>
+    <w:link w:val="Title"/>
     <w:uiPriority w:val="10"/>
     <w:rsid w:val="00496B28"/>
     <w:rPr>
@@ -6805,11 +7183,11 @@
       <w:szCs w:val="56"/>
     </w:rPr>
   </w:style>
-  <w:style w:type="paragraph" w:styleId="Subttulo">
+  <w:style w:type="paragraph" w:styleId="Subtitle">
     <w:name w:val="Subtitle"/>
     <w:basedOn w:val="Normal"/>
     <w:next w:val="Normal"/>
-    <w:link w:val="SubttuloCar"/>
+    <w:link w:val="SubtitleChar"/>
     <w:uiPriority w:val="11"/>
     <w:qFormat/>
     <w:rsid w:val="00496B28"/>
@@ -6826,10 +7204,10 @@
       <w:szCs w:val="28"/>
     </w:rPr>
   </w:style>
-  <w:style w:type="character" w:customStyle="1" w:styleId="SubttuloCar">
-    <w:name w:val="Subtítulo Car"/>
-    <w:basedOn w:val="Fuentedeprrafopredeter"/>
-    <w:link w:val="Subttulo"/>
+  <w:style w:type="character" w:customStyle="1" w:styleId="SubtitleChar">
+    <w:name w:val="Subtitle Char"/>
+    <w:basedOn w:val="DefaultParagraphFont"/>
+    <w:link w:val="Subtitle"/>
     <w:uiPriority w:val="11"/>
     <w:rsid w:val="00496B28"/>
     <w:rPr>
@@ -6840,11 +7218,11 @@
       <w:szCs w:val="28"/>
     </w:rPr>
   </w:style>
-  <w:style w:type="paragraph" w:styleId="Cita">
+  <w:style w:type="paragraph" w:styleId="Quote">
     <w:name w:val="Quote"/>
     <w:basedOn w:val="Normal"/>
     <w:next w:val="Normal"/>
-    <w:link w:val="CitaCar"/>
+    <w:link w:val="QuoteChar"/>
     <w:uiPriority w:val="29"/>
     <w:qFormat/>
     <w:rsid w:val="00496B28"/>
@@ -6858,10 +7236,10 @@
       <w:color w:val="404040" w:themeColor="text1" w:themeTint="BF"/>
     </w:rPr>
   </w:style>
-  <w:style w:type="character" w:customStyle="1" w:styleId="CitaCar">
-    <w:name w:val="Cita Car"/>
-    <w:basedOn w:val="Fuentedeprrafopredeter"/>
-    <w:link w:val="Cita"/>
+  <w:style w:type="character" w:customStyle="1" w:styleId="QuoteChar">
+    <w:name w:val="Quote Char"/>
+    <w:basedOn w:val="DefaultParagraphFont"/>
+    <w:link w:val="Quote"/>
     <w:uiPriority w:val="29"/>
     <w:rsid w:val="00496B28"/>
     <w:rPr>
@@ -6870,7 +7248,7 @@
       <w:color w:val="404040" w:themeColor="text1" w:themeTint="BF"/>
     </w:rPr>
   </w:style>
-  <w:style w:type="paragraph" w:styleId="Prrafodelista">
+  <w:style w:type="paragraph" w:styleId="ListParagraph">
     <w:name w:val="List Paragraph"/>
     <w:basedOn w:val="Normal"/>
     <w:uiPriority w:val="34"/>
@@ -6881,9 +7259,9 @@
       <w:contextualSpacing/>
     </w:pPr>
   </w:style>
-  <w:style w:type="character" w:styleId="nfasisintenso">
+  <w:style w:type="character" w:styleId="IntenseEmphasis">
     <w:name w:val="Intense Emphasis"/>
-    <w:basedOn w:val="Fuentedeprrafopredeter"/>
+    <w:basedOn w:val="DefaultParagraphFont"/>
     <w:uiPriority w:val="21"/>
     <w:qFormat/>
     <w:rsid w:val="00496B28"/>
@@ -6893,11 +7271,11 @@
       <w:color w:val="0F4761" w:themeColor="accent1" w:themeShade="BF"/>
     </w:rPr>
   </w:style>
-  <w:style w:type="paragraph" w:styleId="Citadestacada">
+  <w:style w:type="paragraph" w:styleId="IntenseQuote">
     <w:name w:val="Intense Quote"/>
     <w:basedOn w:val="Normal"/>
     <w:next w:val="Normal"/>
-    <w:link w:val="CitadestacadaCar"/>
+    <w:link w:val="IntenseQuoteChar"/>
     <w:uiPriority w:val="30"/>
     <w:qFormat/>
     <w:rsid w:val="00496B28"/>
@@ -6916,10 +7294,10 @@
       <w:color w:val="0F4761" w:themeColor="accent1" w:themeShade="BF"/>
     </w:rPr>
   </w:style>
-  <w:style w:type="character" w:customStyle="1" w:styleId="CitadestacadaCar">
-    <w:name w:val="Cita destacada Car"/>
-    <w:basedOn w:val="Fuentedeprrafopredeter"/>
-    <w:link w:val="Citadestacada"/>
+  <w:style w:type="character" w:customStyle="1" w:styleId="IntenseQuoteChar">
+    <w:name w:val="Intense Quote Char"/>
+    <w:basedOn w:val="DefaultParagraphFont"/>
+    <w:link w:val="IntenseQuote"/>
     <w:uiPriority w:val="30"/>
     <w:rsid w:val="00496B28"/>
     <w:rPr>
@@ -6928,9 +7306,9 @@
       <w:color w:val="0F4761" w:themeColor="accent1" w:themeShade="BF"/>
     </w:rPr>
   </w:style>
-  <w:style w:type="character" w:styleId="Referenciaintensa">
+  <w:style w:type="character" w:styleId="IntenseReference">
     <w:name w:val="Intense Reference"/>
-    <w:basedOn w:val="Fuentedeprrafopredeter"/>
+    <w:basedOn w:val="DefaultParagraphFont"/>
     <w:uiPriority w:val="32"/>
     <w:qFormat/>
     <w:rsid w:val="00496B28"/>
@@ -6942,9 +7320,9 @@
       <w:spacing w:val="5"/>
     </w:rPr>
   </w:style>
-  <w:style w:type="character" w:styleId="Hipervnculo">
+  <w:style w:type="character" w:styleId="Hyperlink">
     <w:name w:val="Hyperlink"/>
-    <w:basedOn w:val="Fuentedeprrafopredeter"/>
+    <w:basedOn w:val="DefaultParagraphFont"/>
     <w:uiPriority w:val="99"/>
     <w:unhideWhenUsed/>
     <w:rsid w:val="00496B28"/>
@@ -6953,9 +7331,9 @@
       <w:u w:val="single"/>
     </w:rPr>
   </w:style>
-  <w:style w:type="character" w:styleId="Mencinsinresolver">
+  <w:style w:type="character" w:styleId="UnresolvedMention">
     <w:name w:val="Unresolved Mention"/>
-    <w:basedOn w:val="Fuentedeprrafopredeter"/>
+    <w:basedOn w:val="DefaultParagraphFont"/>
     <w:uiPriority w:val="99"/>
     <w:semiHidden/>
     <w:unhideWhenUsed/>
@@ -6965,10 +7343,10 @@
       <w:shd w:val="clear" w:color="auto" w:fill="E1DFDD"/>
     </w:rPr>
   </w:style>
-  <w:style w:type="paragraph" w:styleId="Encabezado">
+  <w:style w:type="paragraph" w:styleId="Header">
     <w:name w:val="header"/>
     <w:basedOn w:val="Normal"/>
-    <w:link w:val="EncabezadoCar"/>
+    <w:link w:val="HeaderChar"/>
     <w:uiPriority w:val="99"/>
     <w:unhideWhenUsed/>
     <w:rsid w:val="004B2AD1"/>
@@ -6980,17 +7358,17 @@
       <w:spacing w:after="0" w:line="240" w:lineRule="auto"/>
     </w:pPr>
   </w:style>
-  <w:style w:type="character" w:customStyle="1" w:styleId="EncabezadoCar">
-    <w:name w:val="Encabezado Car"/>
-    <w:basedOn w:val="Fuentedeprrafopredeter"/>
-    <w:link w:val="Encabezado"/>
+  <w:style w:type="character" w:customStyle="1" w:styleId="HeaderChar">
+    <w:name w:val="Header Char"/>
+    <w:basedOn w:val="DefaultParagraphFont"/>
+    <w:link w:val="Header"/>
     <w:uiPriority w:val="99"/>
     <w:rsid w:val="004B2AD1"/>
   </w:style>
-  <w:style w:type="paragraph" w:styleId="Piedepgina">
+  <w:style w:type="paragraph" w:styleId="Footer">
     <w:name w:val="footer"/>
     <w:basedOn w:val="Normal"/>
-    <w:link w:val="PiedepginaCar"/>
+    <w:link w:val="FooterChar"/>
     <w:uiPriority w:val="99"/>
     <w:unhideWhenUsed/>
     <w:rsid w:val="004B2AD1"/>
@@ -7002,10 +7380,10 @@
       <w:spacing w:after="0" w:line="240" w:lineRule="auto"/>
     </w:pPr>
   </w:style>
-  <w:style w:type="character" w:customStyle="1" w:styleId="PiedepginaCar">
-    <w:name w:val="Pie de página Car"/>
-    <w:basedOn w:val="Fuentedeprrafopredeter"/>
-    <w:link w:val="Piedepgina"/>
+  <w:style w:type="character" w:customStyle="1" w:styleId="FooterChar">
+    <w:name w:val="Footer Char"/>
+    <w:basedOn w:val="DefaultParagraphFont"/>
+    <w:link w:val="Footer"/>
     <w:uiPriority w:val="99"/>
     <w:rsid w:val="004B2AD1"/>
   </w:style>

</xml_diff>